<commit_message>
Adding cards 012 + 013.
</commit_message>
<xml_diff>
--- a/AO_early-alpha/card-files/AO_early-alpha_data/factionE_MountGrandsire_script.docx
+++ b/AO_early-alpha/card-files/AO_early-alpha_data/factionE_MountGrandsire_script.docx
@@ -95,7 +95,7 @@
     <w:p>
       <w:pPr>
         <w:rPr>
-          <w:rFonts w:ascii="Times New Roman" w:hAnsi="Times New Roman" w:cs="Times New Roman"/>
+          <w:rFonts w:ascii="Cambria Math" w:hAnsi="Cambria Math" w:cs="Cambria Math"/>
           <w:sz w:val="144"/>
           <w:szCs w:val="144"/>
         </w:rPr>
@@ -141,6 +141,63 @@
           <w:szCs w:val="144"/>
         </w:rPr>
         <w:t>=Axe</w:t>
+      </w:r>
+    </w:p>
+    <w:p>
+      <w:pPr>
+        <w:rPr>
+          <w:rFonts w:ascii="Times New Roman" w:hAnsi="Times New Roman" w:cs="Times New Roman"/>
+          <w:sz w:val="144"/>
+          <w:szCs w:val="144"/>
+        </w:rPr>
+      </w:pPr>
+      <w:r>
+        <w:rPr>
+          <w:rFonts w:ascii="Times New Roman" w:hAnsi="Times New Roman" w:cs="Times New Roman"/>
+          <w:sz w:val="144"/>
+          <w:szCs w:val="144"/>
+        </w:rPr>
+        <w:t>Ꝺ</w:t>
+      </w:r>
+      <w:r>
+        <w:rPr>
+          <w:rFonts w:ascii="Times New Roman" w:hAnsi="Times New Roman" w:cs="Times New Roman"/>
+          <w:sz w:val="144"/>
+          <w:szCs w:val="144"/>
+        </w:rPr>
+        <w:t>î</w:t>
+      </w:r>
+      <w:r>
+        <w:rPr>
+          <w:rFonts w:ascii="Times New Roman" w:hAnsi="Times New Roman" w:cs="Times New Roman"/>
+          <w:sz w:val="144"/>
+          <w:szCs w:val="144"/>
+        </w:rPr>
+        <w:t>ꝿ</w:t>
+      </w:r>
+      <w:r>
+        <w:rPr>
+          <w:rFonts w:ascii="Times New Roman" w:hAnsi="Times New Roman" w:cs="Times New Roman"/>
+          <w:sz w:val="144"/>
+          <w:szCs w:val="144"/>
+        </w:rPr>
+        <w:t>/</w:t>
+      </w:r>
+      <w:r>
+        <w:rPr>
+          <w:rFonts w:ascii="Times New Roman" w:hAnsi="Times New Roman" w:cs="Times New Roman"/>
+          <w:sz w:val="144"/>
+          <w:szCs w:val="144"/>
+        </w:rPr>
+        <w:t>Ꝺǐꝿ</w:t>
+      </w:r>
+      <w:r>
+        <w:rPr>
+          <w:rFonts w:ascii="Times New Roman" w:hAnsi="Times New Roman" w:cs="Times New Roman"/>
+          <w:sz w:val="144"/>
+          <w:szCs w:val="144"/>
+        </w:rPr>
+        <w:t>=Dig</w:t>
       </w:r>
     </w:p>
     <w:p>
@@ -866,7 +923,6 @@
   <w:style w:type="character" w:default="1" w:styleId="DefaultParagraphFont">
     <w:name w:val="Default Paragraph Font"/>
     <w:uiPriority w:val="1"/>
-    <w:semiHidden/>
     <w:unhideWhenUsed/>
   </w:style>
   <w:style w:type="table" w:default="1" w:styleId="TableNormal">

</xml_diff>